<commit_message>
release(0.4.0): manager-docs workflow — ROADMAP, bottom navs, status bar, /spec page, docs-currency guard — 690 tests / 100 files; both Word editions regenerated (0 field codes)
</commit_message>
<xml_diff>
--- a/docs/ICJIA-Studio-20-rewrite-copperhead.docx
+++ b/docs/ICJIA-Studio-20-rewrite-copperhead.docx
@@ -2,7 +2,7 @@
 <file path=word/document.xml><?xml version="1.0" encoding="utf-8"?>
 <w:document xmlns:w="http://schemas.openxmlformats.org/wordprocessingml/2006/main" xmlns:m="http://schemas.openxmlformats.org/officeDocument/2006/math" xmlns:r="http://schemas.openxmlformats.org/officeDocument/2006/relationships" xmlns:o="urn:schemas-microsoft-com:office:office" xmlns:v="urn:schemas-microsoft-com:vml" xmlns:w10="urn:schemas-microsoft-com:office:word" xmlns:a="http://schemas.openxmlformats.org/drawingml/2006/main" xmlns:pic="http://schemas.openxmlformats.org/drawingml/2006/picture" xmlns:wp="http://schemas.openxmlformats.org/drawingml/2006/wordprocessingDrawing">
   <w:body>
-    <w:bookmarkStart w:id="49" w:name="hub-studio-20"/>
+    <w:bookmarkStart w:id="54" w:name="hub-studio-20"/>
     <w:p>
       <w:pPr>
         <w:pStyle w:val="Heading1"/>
@@ -14396,6 +14396,246 @@
         </w:pict>
       </w:r>
     </w:p>
+    <w:bookmarkEnd w:id="47"/>
+    <w:bookmarkEnd w:id="48"/>
+    <w:bookmarkStart w:id="53" w:name="whats-changed-recently"/>
+    <w:p>
+      <w:pPr>
+        <w:pStyle w:val="Heading2"/>
+      </w:pPr>
+      <w:r>
+        <w:t xml:space="preserve">What's changed recently</w:t>
+      </w:r>
+    </w:p>
+    <w:p>
+      <w:pPr>
+        <w:pStyle w:val="FirstParagraph"/>
+      </w:pPr>
+      <w:r>
+        <w:t xml:space="preserve">A short digest for managers, newest first — the complete version-by-version record is the</w:t>
+      </w:r>
+      <w:r>
+        <w:t xml:space="preserve"> </w:t>
+      </w:r>
+      <w:hyperlink r:id="rId49">
+        <w:r>
+          <w:rPr>
+            <w:rStyle w:val="Hyperlink"/>
+          </w:rPr>
+          <w:t xml:space="preserve">changelog</w:t>
+        </w:r>
+      </w:hyperlink>
+      <w:r>
+        <w:t xml:space="preserve">, and the</w:t>
+      </w:r>
+      <w:r>
+        <w:t xml:space="preserve"> </w:t>
+      </w:r>
+      <w:r>
+        <w:t xml:space="preserve">living list of what's in flight and what's next is the</w:t>
+      </w:r>
+      <w:r>
+        <w:t xml:space="preserve"> </w:t>
+      </w:r>
+      <w:hyperlink r:id="rId50">
+        <w:r>
+          <w:rPr>
+            <w:rStyle w:val="Hyperlink"/>
+          </w:rPr>
+          <w:t xml:space="preserve">roadmap</w:t>
+        </w:r>
+      </w:hyperlink>
+      <w:r>
+        <w:t xml:space="preserve">.</w:t>
+      </w:r>
+    </w:p>
+    <w:p>
+      <w:pPr>
+        <w:pStyle w:val="Compact"/>
+        <w:numPr>
+          <w:ilvl w:val="0"/>
+          <w:numId w:val="1013"/>
+        </w:numPr>
+      </w:pPr>
+      <w:r>
+        <w:rPr>
+          <w:b/>
+          <w:bCs/>
+        </w:rPr>
+        <w:t xml:space="preserve">2026-07-16 — Manager-docs workflow (v0.4.0).</w:t>
+      </w:r>
+      <w:r>
+        <w:t xml:space="preserve"> </w:t>
+      </w:r>
+      <w:r>
+        <w:t xml:space="preserve">This document, the README, the analysis</w:t>
+      </w:r>
+      <w:r>
+        <w:t xml:space="preserve"> </w:t>
+      </w:r>
+      <w:r>
+        <w:t xml:space="preserve">document, and the new roadmap now carry a version-stamped bottom nav; the Studio itself</w:t>
+      </w:r>
+      <w:r>
+        <w:t xml:space="preserve"> </w:t>
+      </w:r>
+      <w:r>
+        <w:t xml:space="preserve">gained a bottom status bar (version + doc links) and an in-app</w:t>
+      </w:r>
+      <w:r>
+        <w:t xml:space="preserve"> </w:t>
+      </w:r>
+      <w:r>
+        <w:rPr>
+          <w:b/>
+          <w:bCs/>
+        </w:rPr>
+        <w:t xml:space="preserve">Spec &amp; status</w:t>
+      </w:r>
+      <w:r>
+        <w:t xml:space="preserve"> </w:t>
+      </w:r>
+      <w:r>
+        <w:t xml:space="preserve">page</w:t>
+      </w:r>
+      <w:r>
+        <w:t xml:space="preserve"> </w:t>
+      </w:r>
+      <w:r>
+        <w:t xml:space="preserve">rendering this document, so a manager can always read the latest state without asking a</w:t>
+      </w:r>
+      <w:r>
+        <w:t xml:space="preserve"> </w:t>
+      </w:r>
+      <w:r>
+        <w:t xml:space="preserve">developer. Doc currency is enforced by an automated test.</w:t>
+      </w:r>
+    </w:p>
+    <w:p>
+      <w:pPr>
+        <w:pStyle w:val="Compact"/>
+        <w:numPr>
+          <w:ilvl w:val="0"/>
+          <w:numId w:val="1013"/>
+        </w:numPr>
+      </w:pPr>
+      <w:r>
+        <w:rPr>
+          <w:b/>
+          <w:bCs/>
+        </w:rPr>
+        <w:t xml:space="preserve">2026-07-16 — Media-library picker: design approved, build underway.</w:t>
+      </w:r>
+      <w:r>
+        <w:t xml:space="preserve"> </w:t>
+      </w:r>
+      <w:r>
+        <w:t xml:space="preserve">Every image</w:t>
+      </w:r>
+      <w:r>
+        <w:t xml:space="preserve"> </w:t>
+      </w:r>
+      <w:r>
+        <w:t xml:space="preserve">surface will open on the ~20 newest Media Library images (searchable) with</w:t>
+      </w:r>
+      <w:r>
+        <w:t xml:space="preserve"> </w:t>
+      </w:r>
+      <w:r>
+        <w:t xml:space="preserve">upload-from-desktop one tab away; picking an image that lacks alt text requires supplying</w:t>
+      </w:r>
+      <w:r>
+        <w:t xml:space="preserve"> </w:t>
+      </w:r>
+      <w:r>
+        <w:t xml:space="preserve">it, which is written back to the shared library. Works identically in the public demo,</w:t>
+      </w:r>
+      <w:r>
+        <w:t xml:space="preserve"> </w:t>
+      </w:r>
+      <w:r>
+        <w:t xml:space="preserve">where nothing persists.</w:t>
+      </w:r>
+    </w:p>
+    <w:p>
+      <w:pPr>
+        <w:pStyle w:val="Compact"/>
+        <w:numPr>
+          <w:ilvl w:val="0"/>
+          <w:numId w:val="1013"/>
+        </w:numPr>
+      </w:pPr>
+      <w:r>
+        <w:rPr>
+          <w:b/>
+          <w:bCs/>
+        </w:rPr>
+        <w:t xml:space="preserve">2026-07-11 — Body markdown linter shipped (v0.3.0).</w:t>
+      </w:r>
+      <w:r>
+        <w:t xml:space="preserve"> </w:t>
+      </w:r>
+      <w:r>
+        <w:t xml:space="preserve">A "Check" button in the editor</w:t>
+      </w:r>
+      <w:r>
+        <w:t xml:space="preserve"> </w:t>
+      </w:r>
+      <w:r>
+        <w:t xml:space="preserve">flags heading/link/image problems in plain language with jump-to-line results.</w:t>
+      </w:r>
+      <w:r>
+        <w:t xml:space="preserve"> </w:t>
+      </w:r>
+      <w:r>
+        <w:rPr>
+          <w:b/>
+          <w:bCs/>
+        </w:rPr>
+        <w:t xml:space="preserve">677 automated tests / 97 files.</w:t>
+      </w:r>
+    </w:p>
+    <w:p>
+      <w:pPr>
+        <w:pStyle w:val="Compact"/>
+        <w:numPr>
+          <w:ilvl w:val="0"/>
+          <w:numId w:val="1013"/>
+        </w:numPr>
+      </w:pPr>
+      <w:r>
+        <w:rPr>
+          <w:b/>
+          <w:bCs/>
+        </w:rPr>
+        <w:t xml:space="preserve">2026-07-11 — CI pipeline + search-engine exclusion (v0.2.0).</w:t>
+      </w:r>
+      <w:r>
+        <w:t xml:space="preserve"> </w:t>
+      </w:r>
+      <w:r>
+        <w:t xml:space="preserve">Every push and pull</w:t>
+      </w:r>
+      <w:r>
+        <w:t xml:space="preserve"> </w:t>
+      </w:r>
+      <w:r>
+        <w:t xml:space="preserve">request now re-runs the typecheck, the full test suite, and both builds automatically;</w:t>
+      </w:r>
+      <w:r>
+        <w:t xml:space="preserve"> </w:t>
+      </w:r>
+      <w:r>
+        <w:t xml:space="preserve">the Studio's pages are excluded from search engines.</w:t>
+      </w:r>
+    </w:p>
+    <w:p>
+      <w:r>
+        <w:pict>
+          <v:rect style="width:0;height:1.5pt" o:hralign="center" o:hrstd="t" o:hr="t"/>
+        </w:pict>
+      </w:r>
+    </w:p>
     <w:p>
       <w:pPr>
         <w:pStyle w:val="FirstParagraph"/>
@@ -14433,7 +14673,7 @@
           <w:i/>
           <w:iCs/>
         </w:rPr>
-        <w:t xml:space="preserve">roles/CI). The Studio is feature-complete in the workshop with a public</w:t>
+        <w:t xml:space="preserve">roles/CI), and 2026-07-16 for the manager-docs workflow ("What's changed recently,"</w:t>
       </w:r>
       <w:r>
         <w:rPr>
@@ -14447,7 +14687,21 @@
           <w:i/>
           <w:iCs/>
         </w:rPr>
-        <w:t xml:space="preserve">demonstration at</w:t>
+        <w:t xml:space="preserve">the roadmap, the bottom navs, and the in-app Spec &amp; status page). The Studio is</w:t>
+      </w:r>
+      <w:r>
+        <w:rPr>
+          <w:i/>
+          <w:iCs/>
+        </w:rPr>
+        <w:t xml:space="preserve"> </w:t>
+      </w:r>
+      <w:r>
+        <w:rPr>
+          <w:i/>
+          <w:iCs/>
+        </w:rPr>
+        <w:t xml:space="preserve">feature-complete in the workshop with a public demonstration at</w:t>
       </w:r>
       <w:r>
         <w:rPr>
@@ -14471,7 +14725,7 @@
           <w:i/>
           <w:iCs/>
         </w:rPr>
-        <w:t xml:space="preserve">; this document will evolve as</w:t>
+        <w:t xml:space="preserve">; this document will evolve as the remaining setup</w:t>
       </w:r>
       <w:r>
         <w:rPr>
@@ -14485,7 +14739,7 @@
           <w:i/>
           <w:iCs/>
         </w:rPr>
-        <w:t xml:space="preserve">the remaining setup and go-live steps in Section 4 are completed. Nothing</w:t>
+        <w:t xml:space="preserve">and go-live steps in Section 4 are completed. Nothing described here publishes to</w:t>
       </w:r>
       <w:r>
         <w:rPr>
@@ -14499,12 +14753,127 @@
           <w:i/>
           <w:iCs/>
         </w:rPr>
-        <w:t xml:space="preserve">described here publishes to the live system yet.</w:t>
-      </w:r>
-    </w:p>
-    <w:bookmarkEnd w:id="47"/>
-    <w:bookmarkEnd w:id="48"/>
-    <w:bookmarkEnd w:id="49"/>
+        <w:t xml:space="preserve">the live system yet.</w:t>
+      </w:r>
+    </w:p>
+    <w:p>
+      <w:r>
+        <w:pict>
+          <v:rect style="width:0;height:1.5pt" o:hralign="center" o:hrstd="t" o:hr="t"/>
+        </w:pict>
+      </w:r>
+    </w:p>
+    <w:p>
+      <w:pPr>
+        <w:pStyle w:val="FirstParagraph"/>
+      </w:pPr>
+      <w:r>
+        <w:rPr>
+          <w:b/>
+          <w:bCs/>
+        </w:rPr>
+        <w:t xml:space="preserve">Hub Studio 2.0 · Studio build v0.4.0</w:t>
+      </w:r>
+      <w:r>
+        <w:t xml:space="preserve"> </w:t>
+      </w:r>
+      <w:r>
+        <w:t xml:space="preserve">— for managers monitoring this project:</w:t>
+      </w:r>
+      <w:r>
+        <w:t xml:space="preserve"> </w:t>
+      </w:r>
+      <w:hyperlink r:id="rId51">
+        <w:r>
+          <w:rPr>
+            <w:rStyle w:val="Hyperlink"/>
+          </w:rPr>
+          <w:t xml:space="preserve">Spec &amp; status</w:t>
+        </w:r>
+      </w:hyperlink>
+      <w:r>
+        <w:t xml:space="preserve"> </w:t>
+      </w:r>
+      <w:r>
+        <w:t xml:space="preserve">·</w:t>
+      </w:r>
+      <w:r>
+        <w:t xml:space="preserve"> </w:t>
+      </w:r>
+      <w:hyperlink r:id="rId49">
+        <w:r>
+          <w:rPr>
+            <w:rStyle w:val="Hyperlink"/>
+          </w:rPr>
+          <w:t xml:space="preserve">What's changed (changelog)</w:t>
+        </w:r>
+      </w:hyperlink>
+      <w:r>
+        <w:t xml:space="preserve"> </w:t>
+      </w:r>
+      <w:r>
+        <w:t xml:space="preserve">·</w:t>
+      </w:r>
+      <w:r>
+        <w:t xml:space="preserve"> </w:t>
+      </w:r>
+      <w:hyperlink r:id="rId50">
+        <w:r>
+          <w:rPr>
+            <w:rStyle w:val="Hyperlink"/>
+          </w:rPr>
+          <w:t xml:space="preserve">What's next (roadmap)</w:t>
+        </w:r>
+      </w:hyperlink>
+      <w:r>
+        <w:t xml:space="preserve"> </w:t>
+      </w:r>
+      <w:r>
+        <w:t xml:space="preserve">·</w:t>
+      </w:r>
+      <w:r>
+        <w:t xml:space="preserve"> </w:t>
+      </w:r>
+      <w:hyperlink r:id="rId52">
+        <w:r>
+          <w:rPr>
+            <w:rStyle w:val="Hyperlink"/>
+          </w:rPr>
+          <w:t xml:space="preserve">README</w:t>
+        </w:r>
+      </w:hyperlink>
+      <w:r>
+        <w:t xml:space="preserve"> </w:t>
+      </w:r>
+      <w:r>
+        <w:t xml:space="preserve">·</w:t>
+      </w:r>
+      <w:r>
+        <w:t xml:space="preserve"> </w:t>
+      </w:r>
+      <w:hyperlink r:id="rId9">
+        <w:r>
+          <w:rPr>
+            <w:rStyle w:val="Hyperlink"/>
+          </w:rPr>
+          <w:t xml:space="preserve">Live demo</w:t>
+        </w:r>
+      </w:hyperlink>
+    </w:p>
+    <w:p>
+      <w:pPr>
+        <w:pStyle w:val="BodyText"/>
+      </w:pPr>
+      <w:r>
+        <w:rPr>
+          <w:i/>
+          <w:iCs/>
+        </w:rPr>
+        <w:t xml:space="preserve">These links always open the latest rendered version of each document.</w:t>
+      </w:r>
+    </w:p>
+    <w:bookmarkEnd w:id="53"/>
+    <w:bookmarkEnd w:id="54"/>
     <w:sectPr>
       <w:footnotePr>
         <w:numRestart w:val="eachSect"/>
@@ -14755,6 +15124,9 @@
     <w:abstractNumId w:val="991"/>
   </w:num>
   <w:num w:numId="1012">
+    <w:abstractNumId w:val="991"/>
+  </w:num>
+  <w:num w:numId="1013">
     <w:abstractNumId w:val="991"/>
   </w:num>
 </w:numbering>

</xml_diff>

<commit_message>
release(0.8.4): accessibility riders — radiogroup swatches, roving-tabindex toolbar (APG), modal drawer dialog, hard-scoped document-level keyboard-create (revives the dead body-focus Enter path; fixes in-article-link over-capture) + official-ICJIA-wordmark og:image with og/twitter meta (Netlify URL env, no CSP delta) + security-audit delta log current (0.4.0→0.8.4, fresh npm audit 0 crit/high/mod) — 879 tests / 109 files (11 new, test-first); full local gate matrix green (suite ×3, typecheck, build + override guard, demo generate + bypass control); driven live in demo (radiogroup/roving/drawer/keyboard-create verified in-browser; axe clean on the new surface); docs current; Word editions regenerated (0 field codes)
</commit_message>
<xml_diff>
--- a/docs/ICJIA-Studio-20-rewrite-copperhead.docx
+++ b/docs/ICJIA-Studio-20-rewrite-copperhead.docx
@@ -14642,6 +14642,82 @@
           <w:b/>
           <w:bCs/>
         </w:rPr>
+        <w:t xml:space="preserve">2026-07-17 — Accessibility riders shipped; social card added (v0.8.4).</w:t>
+      </w:r>
+      <w:r>
+        <w:t xml:space="preserve"> </w:t>
+      </w:r>
+      <w:r>
+        <w:t xml:space="preserve">The four</w:t>
+      </w:r>
+      <w:r>
+        <w:t xml:space="preserve"> </w:t>
+      </w:r>
+      <w:r>
+        <w:t xml:space="preserve">screen-reader/keyboard refinements from the annotations review are in: the highlight</w:t>
+      </w:r>
+      <w:r>
+        <w:t xml:space="preserve"> </w:t>
+      </w:r>
+      <w:r>
+        <w:t xml:space="preserve">color swatches are a true radio group, the reviewer toolbar is a single Tab stop with</w:t>
+      </w:r>
+      <w:r>
+        <w:t xml:space="preserve"> </w:t>
+      </w:r>
+      <w:r>
+        <w:t xml:space="preserve">arrow-key movement, the phone-size comments drawer behaves as a proper dialog (focus</w:t>
+      </w:r>
+      <w:r>
+        <w:t xml:space="preserve"> </w:t>
+      </w:r>
+      <w:r>
+        <w:t xml:space="preserve">moves in, Escape closes and puts focus back), and starting a comment from the keyboard</w:t>
+      </w:r>
+      <w:r>
+        <w:t xml:space="preserve"> </w:t>
+      </w:r>
+      <w:r>
+        <w:t xml:space="preserve">(select text, press Enter) now works reliably — and never hijacks Enter on links,</w:t>
+      </w:r>
+      <w:r>
+        <w:t xml:space="preserve"> </w:t>
+      </w:r>
+      <w:r>
+        <w:t xml:space="preserve">buttons, or reply boxes. The repository and app also gained a dark social-preview</w:t>
+      </w:r>
+      <w:r>
+        <w:t xml:space="preserve"> </w:t>
+      </w:r>
+      <w:r>
+        <w:t xml:space="preserve">card (the image shown when a Studio link is shared), and the security audit's</w:t>
+      </w:r>
+      <w:r>
+        <w:t xml:space="preserve"> </w:t>
+      </w:r>
+      <w:r>
+        <w:t xml:space="preserve">between-passes delta log was brought current with a fresh dependency-vulnerability</w:t>
+      </w:r>
+      <w:r>
+        <w:t xml:space="preserve"> </w:t>
+      </w:r>
+      <w:r>
+        <w:t xml:space="preserve">re-check (still 0 critical / high / moderate).</w:t>
+      </w:r>
+    </w:p>
+    <w:p>
+      <w:pPr>
+        <w:pStyle w:val="Compact"/>
+        <w:numPr>
+          <w:ilvl w:val="0"/>
+          <w:numId w:val="1013"/>
+        </w:numPr>
+      </w:pPr>
+      <w:r>
+        <w:rPr>
+          <w:b/>
+          <w:bCs/>
+        </w:rPr>
         <w:t xml:space="preserve">2026-07-16 — Edit-conflict detection shipped (v0.8.0).</w:t>
       </w:r>
       <w:r>
@@ -14814,7 +14890,7 @@
           <w:b/>
           <w:bCs/>
         </w:rPr>
-        <w:t xml:space="preserve">868 automated tests / 109 files.</w:t>
+        <w:t xml:space="preserve">879 automated tests / 109 files.</w:t>
       </w:r>
     </w:p>
     <w:p>
@@ -15392,7 +15468,7 @@
           <w:b/>
           <w:bCs/>
         </w:rPr>
-        <w:t xml:space="preserve">Hub Studio 2.0 · Studio build v0.8.3</w:t>
+        <w:t xml:space="preserve">Hub Studio 2.0 · Studio build v0.8.4</w:t>
       </w:r>
       <w:r>
         <w:t xml:space="preserve"> </w:t>

</xml_diff>